<commit_message>
Add key code snippets to presentation and report
</commit_message>
<xml_diff>
--- a/deliverables/Java_모의주식투자_개인프로젝트_보고서.docx
+++ b/deliverables/Java_모의주식투자_개인프로젝트_보고서.docx
@@ -1446,7 +1446,137 @@
         <w:pStyle w:val="Heading2"/>
       </w:pPr>
       <w:r>
-        <w:t>3.2 상속과 인터페이스 사용 이유</w:t>
+        <w:t>3.2 주요 코드 일부</w:t>
+      </w:r>
+    </w:p>
+    <w:p>
+      <w:pPr>
+        <w:spacing w:after="120"/>
+      </w:pPr>
+      <w:r>
+        <w:t>아래 코드는 발표 때 보여주기 위한 핵심 부분만 줄인 것이다. 전체 코드를 모두 설명하기보다 HTTP 요청이 들어오고, 외부 시세를 조회하고, 매수 결과를 저장하는 흐름을 중심으로 정리했다.</w:t>
+      </w:r>
+    </w:p>
+    <w:p>
+      <w:pPr>
+        <w:spacing w:before="60" w:after="120"/>
+        <w:ind w:left="216" w:right="216"/>
+        <w:shd w:fill="F1F5F9"/>
+      </w:pPr>
+      <w:r>
+        <w:rPr>
+          <w:rFonts w:ascii="Consolas" w:hAnsi="Consolas"/>
+          <w:sz w:val="17"/>
+        </w:rPr>
+        <w:t>// MiniHandler.java - HTTP 요청을 기능별 메서드로 연결</w:t>
+        <w:br/>
+        <w:t>if ("GET".equals(method) &amp;&amp; "/api/state".equals(path)) {</w:t>
+        <w:br/>
+        <w:t xml:space="preserve">    send(exchange, 200, "application/json", project.stateJson());</w:t>
+        <w:br/>
+        <w:t>}</w:t>
+        <w:br/>
+        <w:t>String json = switch (path) {</w:t>
+        <w:br/>
+        <w:t xml:space="preserve">    case "/api/stock/buy" -&gt; project.buyStock(body);</w:t>
+        <w:br/>
+        <w:t xml:space="preserve">    case "/api/stock/sell" -&gt; project.sellStock(body);</w:t>
+        <w:br/>
+        <w:t xml:space="preserve">    default -&gt; Json.obj("ok", false, "error", "없는 API");</w:t>
+        <w:br/>
+        <w:t>};</w:t>
+      </w:r>
+    </w:p>
+    <w:p>
+      <w:pPr>
+        <w:spacing w:before="60" w:after="120"/>
+        <w:ind w:left="216" w:right="216"/>
+        <w:shd w:fill="F1F5F9"/>
+      </w:pPr>
+      <w:r>
+        <w:rPr>
+          <w:rFonts w:ascii="Consolas" w:hAnsi="Consolas"/>
+          <w:sz w:val="17"/>
+        </w:rPr>
+        <w:t>// KisIntegration.java - KIS 현재가 REST API 호출</w:t>
+        <w:br/>
+        <w:t>HttpRequest request = HttpRequest.newBuilder(uri)</w:t>
+        <w:br/>
+        <w:t xml:space="preserve">    .header("authorization", "Bearer " + token)</w:t>
+        <w:br/>
+        <w:t xml:space="preserve">    .header("appkey", config.appKey)</w:t>
+        <w:br/>
+        <w:t xml:space="preserve">    .header("tr_id", "FHKST01010100")</w:t>
+        <w:br/>
+        <w:t xml:space="preserve">    .GET()</w:t>
+        <w:br/>
+        <w:t xml:space="preserve">    .build();</w:t>
+        <w:br/>
+        <w:t>HttpResponse&lt;String&gt; response = client.send(request, BodyHandlers.ofString());</w:t>
+      </w:r>
+    </w:p>
+    <w:p>
+      <w:pPr>
+        <w:spacing w:before="60" w:after="120"/>
+        <w:ind w:left="216" w:right="216"/>
+        <w:shd w:fill="F1F5F9"/>
+      </w:pPr>
+      <w:r>
+        <w:rPr>
+          <w:rFonts w:ascii="Consolas" w:hAnsi="Consolas"/>
+          <w:sz w:val="17"/>
+        </w:rPr>
+        <w:t>// MiniProject.java - 매수 처리와 거래 기록 저장</w:t>
+        <w:br/>
+        <w:t>Stock stock = findStock(stockName);</w:t>
+        <w:br/>
+        <w:t>long total = (long) stock.price * quantity;</w:t>
+        <w:br/>
+        <w:t>if (currentMember.balance &lt; total) return Json.obj("ok", false);</w:t>
+        <w:br/>
+        <w:t>currentMember.balance -= total;</w:t>
+        <w:br/>
+        <w:t>currentMember.shares.put(stockName, share.buy(quantity, total));</w:t>
+        <w:br/>
+        <w:t>logs.add(new TradeLog(currentMember.uid, stockName, quantity, total, "구매"));</w:t>
+        <w:br/>
+        <w:t>saveDatabase();</w:t>
+      </w:r>
+    </w:p>
+    <w:p>
+      <w:pPr>
+        <w:spacing w:before="60" w:after="120"/>
+        <w:ind w:left="216" w:right="216"/>
+        <w:shd w:fill="F1F5F9"/>
+      </w:pPr>
+      <w:r>
+        <w:rPr>
+          <w:rFonts w:ascii="Consolas" w:hAnsi="Consolas"/>
+          <w:sz w:val="17"/>
+        </w:rPr>
+        <w:t>// DatabaseIntegration.java - MySQL 트랜잭션 저장</w:t>
+        <w:br/>
+        <w:t>try (Connection con = DriverManager.getConnection(url, user, password)) {</w:t>
+        <w:br/>
+        <w:t xml:space="preserve">    con.setAutoCommit(false);</w:t>
+        <w:br/>
+        <w:t xml:space="preserve">    insertMembers(con, members);</w:t>
+        <w:br/>
+        <w:t xml:space="preserve">    insertShares(con, members);</w:t>
+        <w:br/>
+        <w:t xml:space="preserve">    insertTradeLogs(con, logs);</w:t>
+        <w:br/>
+        <w:t xml:space="preserve">    con.commit();</w:t>
+        <w:br/>
+        <w:t>}</w:t>
+      </w:r>
+    </w:p>
+    <w:p>
+      <w:pPr>
+        <w:pStyle w:val="Heading2"/>
+      </w:pPr>
+      <w:r>
+        <w:t>3.3 상속과 인터페이스 사용 이유</w:t>
       </w:r>
     </w:p>
     <w:p>
@@ -1798,7 +1928,7 @@
         <w:pStyle w:val="Heading2"/>
       </w:pPr>
       <w:r>
-        <w:t>3.3 AI vs 나의 역할</w:t>
+        <w:t>3.4 AI vs 나의 역할</w:t>
       </w:r>
     </w:p>
     <w:tbl>
@@ -2557,57 +2687,6 @@
       </w:pPr>
       <w:r>
         <w:t>기록 탭: 매수/매도 시간, 종목, 수량, 금액 확인</w:t>
-      </w:r>
-    </w:p>
-    <w:p>
-      <w:pPr>
-        <w:jc w:val="center"/>
-      </w:pPr>
-      <w:r>
-        <w:drawing>
-          <wp:inline xmlns:a="http://schemas.openxmlformats.org/drawingml/2006/main" xmlns:pic="http://schemas.openxmlformats.org/drawingml/2006/picture">
-            <wp:extent cx="5852160" cy="3290233"/>
-            <wp:docPr id="1" name="Picture 1"/>
-            <wp:cNvGraphicFramePr>
-              <a:graphicFrameLocks noChangeAspect="1"/>
-            </wp:cNvGraphicFramePr>
-            <a:graphic>
-              <a:graphicData uri="http://schemas.openxmlformats.org/drawingml/2006/picture">
-                <pic:pic>
-                  <pic:nvPicPr>
-                    <pic:cNvPr id="0" name="mock-stock-website-demo-preview.png"/>
-                    <pic:cNvPicPr/>
-                  </pic:nvPicPr>
-                  <pic:blipFill>
-                    <a:blip r:embed="rId9"/>
-                    <a:stretch>
-                      <a:fillRect/>
-                    </a:stretch>
-                  </pic:blipFill>
-                  <pic:spPr>
-                    <a:xfrm>
-                      <a:off x="0" y="0"/>
-                      <a:ext cx="5852160" cy="3290233"/>
-                    </a:xfrm>
-                    <a:prstGeom prst="rect"/>
-                  </pic:spPr>
-                </pic:pic>
-              </a:graphicData>
-            </a:graphic>
-          </wp:inline>
-        </w:drawing>
-      </w:r>
-    </w:p>
-    <w:p>
-      <w:pPr>
-        <w:jc w:val="center"/>
-      </w:pPr>
-      <w:r>
-        <w:rPr>
-          <w:color w:val="667085"/>
-          <w:sz w:val="17"/>
-        </w:rPr>
-        <w:t>시연 영상 미리보기: 종목 상세, 매수 완료 메시지, 가격 그래프, 보유 종목 손익 화면</w:t>
       </w:r>
     </w:p>
     <w:p>

</xml_diff>

<commit_message>
Improve security sessions and update project docs
</commit_message>
<xml_diff>
--- a/deliverables/Java_모의주식투자_개인프로젝트_보고서.docx
+++ b/deliverables/Java_모의주식투자_개인프로젝트_보고서.docx
@@ -168,7 +168,7 @@
                 <w:b w:val="0"/>
                 <w:sz w:val="18"/>
               </w:rPr>
-              <w:t>Java HttpServer, HttpClient, Thread, Collection, JDBC, MySQL</w:t>
+              <w:t>Java HttpServer, HttpClient, Thread, Collection, JDBC, MySQL, 쿠키 세션, SHA-256 비밀번호 해시</w:t>
             </w:r>
           </w:p>
         </w:tc>
@@ -1100,7 +1100,7 @@
                 <w:b w:val="0"/>
                 <w:sz w:val="18"/>
               </w:rPr>
-              <w:t>회원가입, 로그인, 매매, 포트폴리오, 시세 상태 관리</w:t>
+              <w:t>회원가입, 로그인 세션, 매매, 포트폴리오, 시세 상태 관리</w:t>
             </w:r>
           </w:p>
         </w:tc>
@@ -1407,6 +1407,48 @@
           </w:p>
         </w:tc>
       </w:tr>
+      <w:tr>
+        <w:tc>
+          <w:tcPr>
+            <w:tcW w:type="dxa" w:w="3024"/>
+            <w:vAlign w:val="center"/>
+          </w:tcPr>
+          <w:p>
+            <w:pPr>
+              <w:spacing w:after="0"/>
+            </w:pPr>
+            <w:r/>
+            <w:r>
+              <w:rPr>
+                <w:rFonts w:ascii="맑은 고딕" w:hAnsi="맑은 고딕" w:eastAsia="맑은 고딕"/>
+                <w:b w:val="0"/>
+                <w:sz w:val="18"/>
+              </w:rPr>
+              <w:t>PasswordHasher.java</w:t>
+            </w:r>
+          </w:p>
+        </w:tc>
+        <w:tc>
+          <w:tcPr>
+            <w:tcW w:type="dxa" w:w="7488"/>
+            <w:vAlign w:val="center"/>
+          </w:tcPr>
+          <w:p>
+            <w:pPr>
+              <w:spacing w:after="0"/>
+            </w:pPr>
+            <w:r/>
+            <w:r>
+              <w:rPr>
+                <w:rFonts w:ascii="맑은 고딕" w:hAnsi="맑은 고딕" w:eastAsia="맑은 고딕"/>
+                <w:b w:val="0"/>
+                <w:sz w:val="18"/>
+              </w:rPr>
+              <w:t>비밀번호 Salt 생성, SHA-256 해시, 기존 평문 비밀번호 자동 업그레이드</w:t>
+            </w:r>
+          </w:p>
+        </w:tc>
+      </w:tr>
     </w:tbl>
     <w:p/>
     <w:p>
@@ -1468,19 +1510,21 @@
           <w:rFonts w:ascii="Consolas" w:hAnsi="Consolas"/>
           <w:sz w:val="17"/>
         </w:rPr>
-        <w:t>// MiniHandler.java - HTTP 요청을 기능별 메서드로 연결</w:t>
+        <w:t>// MiniHandler.java - 세션 쿠키를 읽고 HTTP 요청을 기능별 메서드로 연결</w:t>
+        <w:br/>
+        <w:t>String sessionId = sessionCookie(exchange);</w:t>
         <w:br/>
         <w:t>if ("GET".equals(method) &amp;&amp; "/api/state".equals(path)) {</w:t>
         <w:br/>
-        <w:t xml:space="preserve">    send(exchange, 200, "application/json", project.stateJson());</w:t>
+        <w:t xml:space="preserve">    send(exchange, 200, "application/json", project.stateJson(sessionId));</w:t>
         <w:br/>
         <w:t>}</w:t>
         <w:br/>
         <w:t>String json = switch (path) {</w:t>
         <w:br/>
-        <w:t xml:space="preserve">    case "/api/stock/buy" -&gt; project.buyStock(body);</w:t>
+        <w:t xml:space="preserve">    case "/api/stock/buy" -&gt; project.buyStock(body, sessionId);</w:t>
         <w:br/>
-        <w:t xml:space="preserve">    case "/api/stock/sell" -&gt; project.sellStock(body);</w:t>
+        <w:t xml:space="preserve">    case "/api/stock/sell" -&gt; project.sellStock(body, sessionId);</w:t>
         <w:br/>
         <w:t xml:space="preserve">    default -&gt; Json.obj("ok", false, "error", "없는 API");</w:t>
         <w:br/>
@@ -1528,17 +1572,19 @@
         </w:rPr>
         <w:t>// MiniProject.java - 매수 처리와 거래 기록 저장</w:t>
         <w:br/>
-        <w:t>Stock stock = findStock(stockName);</w:t>
+        <w:t>Member member = member(sessionId);</w:t>
+        <w:br/>
+        <w:t>Stock stock = member.stocks.get(stockName);</w:t>
         <w:br/>
         <w:t>long total = (long) stock.price * quantity;</w:t>
         <w:br/>
-        <w:t>if (currentMember.balance &lt; total) return Json.obj("ok", false);</w:t>
+        <w:t>if (member.balance &lt; total) return Json.obj("ok", false);</w:t>
         <w:br/>
-        <w:t>currentMember.balance -= total;</w:t>
+        <w:t>member.balance -= total;</w:t>
         <w:br/>
-        <w:t>currentMember.shares.put(stockName, share.buy(quantity, total));</w:t>
+        <w:t>member.shares.put(stockName, share.buy(quantity, total));</w:t>
         <w:br/>
-        <w:t>logs.add(new TradeLog(currentMember.uid, stockName, quantity, total, "구매"));</w:t>
+        <w:t>logs.add(new TradeLog(member.uid, stockName, quantity, total, "구매"));</w:t>
         <w:br/>
         <w:t>saveDatabase();</w:t>
       </w:r>
@@ -2771,7 +2817,7 @@
                 <w:b w:val="0"/>
                 <w:sz w:val="18"/>
               </w:rPr>
-              <w:t>저장 문제</w:t>
+              <w:t>실제 시세 연동 문제</w:t>
             </w:r>
           </w:p>
         </w:tc>
@@ -2791,7 +2837,7 @@
                 <w:b w:val="0"/>
                 <w:sz w:val="18"/>
               </w:rPr>
-              <w:t>서버 재시작 시 데이터가 사라지는 문제를 MySQL 저장 구조로 변경</w:t>
+              <w:t>초기에는 내부 모의 가격과 KIS API 응답값이 섞이면서 삼성전자 같은 종목 가격이 이상해 보였다. 그래서 현재 표시되는 가격이 실제 API 값인지, 초기 더미 값인지 확인했고 시세 갱신 흐름을 정리했다.</w:t>
             </w:r>
           </w:p>
         </w:tc>
@@ -2814,7 +2860,7 @@
                 <w:b w:val="0"/>
                 <w:sz w:val="18"/>
               </w:rPr>
-              <w:t>인코딩 문제</w:t>
+              <w:t>전체 종목 처리 범위 결정</w:t>
             </w:r>
           </w:p>
         </w:tc>
@@ -2835,7 +2881,7 @@
                 <w:b w:val="0"/>
                 <w:sz w:val="18"/>
               </w:rPr>
-              <w:t>javac -encoding UTF-8, HTML 응답 charset, 문서 파일 인코딩을 UTF-8 기준으로 정리</w:t>
+              <w:t>KIS에서 제공하는 전체 종목을 모두 계속 갱신하는 것은 개인 PC에서 실행하는 과제 프로젝트에는 부담이 컸다. 그래서 거래량 상위 종목 중심으로 자동 선별하고, 화면에서는 10개씩 페이지로 나누는 구조를 선택했다.</w:t>
             </w:r>
           </w:p>
         </w:tc>
@@ -2857,7 +2903,7 @@
                 <w:b w:val="0"/>
                 <w:sz w:val="18"/>
               </w:rPr>
-              <w:t>KIS API 키 설정</w:t>
+              <w:t>UI 흐름 개선</w:t>
             </w:r>
           </w:p>
         </w:tc>
@@ -2877,7 +2923,7 @@
                 <w:b w:val="0"/>
                 <w:sz w:val="18"/>
               </w:rPr>
-              <w:t>KIS_APP_KEY, KIS_APP_SECRET, KIS_BASE_URL 환경변수를 사용하도록 분리</w:t>
+              <w:t>처음에는 매매 칸에서 종목을 고르는 방식이라 사용자가 불편했다. 이후 시장 시세에서 종목을 클릭하고, 상세 화면에서 가격 그래프를 확인한 뒤 매수하며, 매도는 보유 종목 기준으로 진행하도록 바꿨다.</w:t>
             </w:r>
           </w:p>
         </w:tc>
@@ -2900,7 +2946,7 @@
                 <w:b w:val="0"/>
                 <w:sz w:val="18"/>
               </w:rPr>
-              <w:t>뉴스 기능 제외</w:t>
+              <w:t>뉴스 기능 제거 판단</w:t>
             </w:r>
           </w:p>
         </w:tc>
@@ -2921,7 +2967,7 @@
                 <w:b w:val="0"/>
                 <w:sz w:val="18"/>
               </w:rPr>
-              <w:t>외부 뉴스 API 키 관리 부담과 기사 품질 편차 때문에 최종 버전에서는 제거</w:t>
+              <w:t>네이버 뉴스 API를 붙이는 시도도 했지만 종목마다 기사 품질 편차가 컸고, ETF나 레버리지 상품은 관련 기사 연결이 애매했다. API 키 관리 부담도 있어 최종 버전에서는 모의투자 목적에 맞는 기능만 남기기로 했다.</w:t>
             </w:r>
           </w:p>
         </w:tc>
@@ -2943,7 +2989,7 @@
                 <w:b w:val="0"/>
                 <w:sz w:val="18"/>
               </w:rPr>
-              <w:t>가격 표시 문제</w:t>
+              <w:t>DB 저장 전환</w:t>
             </w:r>
           </w:p>
         </w:tc>
@@ -2963,137 +3009,7 @@
                 <w:b w:val="0"/>
                 <w:sz w:val="18"/>
               </w:rPr>
-              <w:t>API 갱신 전 초기값과 실제 응답값이 섞이지 않도록 갱신 흐름을 확인</w:t>
-            </w:r>
-          </w:p>
-        </w:tc>
-      </w:tr>
-      <w:tr>
-        <w:tc>
-          <w:tcPr>
-            <w:tcW w:type="dxa" w:w="3024"/>
-            <w:shd w:fill="F6F9FD"/>
-            <w:vAlign w:val="center"/>
-          </w:tcPr>
-          <w:p>
-            <w:pPr>
-              <w:spacing w:after="0"/>
-            </w:pPr>
-            <w:r/>
-            <w:r>
-              <w:rPr>
-                <w:rFonts w:ascii="맑은 고딕" w:hAnsi="맑은 고딕" w:eastAsia="맑은 고딕"/>
-                <w:b w:val="0"/>
-                <w:sz w:val="18"/>
-              </w:rPr>
-              <w:t>종목 수 문제</w:t>
-            </w:r>
-          </w:p>
-        </w:tc>
-        <w:tc>
-          <w:tcPr>
-            <w:tcW w:type="dxa" w:w="7344"/>
-            <w:shd w:fill="F6F9FD"/>
-            <w:vAlign w:val="center"/>
-          </w:tcPr>
-          <w:p>
-            <w:pPr>
-              <w:spacing w:after="0"/>
-            </w:pPr>
-            <w:r/>
-            <w:r>
-              <w:rPr>
-                <w:rFonts w:ascii="맑은 고딕" w:hAnsi="맑은 고딕" w:eastAsia="맑은 고딕"/>
-                <w:b w:val="0"/>
-                <w:sz w:val="18"/>
-              </w:rPr>
-              <w:t>약 2700개 전체 종목을 계속 갱신하지 않고 거래량 상위 종목 중심으로 제한</w:t>
-            </w:r>
-          </w:p>
-        </w:tc>
-      </w:tr>
-      <w:tr>
-        <w:tc>
-          <w:tcPr>
-            <w:tcW w:type="dxa" w:w="3024"/>
-            <w:vAlign w:val="center"/>
-          </w:tcPr>
-          <w:p>
-            <w:pPr>
-              <w:spacing w:after="0"/>
-            </w:pPr>
-            <w:r/>
-            <w:r>
-              <w:rPr>
-                <w:rFonts w:ascii="맑은 고딕" w:hAnsi="맑은 고딕" w:eastAsia="맑은 고딕"/>
-                <w:b w:val="0"/>
-                <w:sz w:val="18"/>
-              </w:rPr>
-              <w:t>UI 복잡도</w:t>
-            </w:r>
-          </w:p>
-        </w:tc>
-        <w:tc>
-          <w:tcPr>
-            <w:tcW w:type="dxa" w:w="7344"/>
-            <w:vAlign w:val="center"/>
-          </w:tcPr>
-          <w:p>
-            <w:pPr>
-              <w:spacing w:after="0"/>
-            </w:pPr>
-            <w:r/>
-            <w:r>
-              <w:rPr>
-                <w:rFonts w:ascii="맑은 고딕" w:hAnsi="맑은 고딕" w:eastAsia="맑은 고딕"/>
-                <w:b w:val="0"/>
-                <w:sz w:val="18"/>
-              </w:rPr>
-              <w:t>목적과 맞지 않는 기능은 줄이고 검색, 즐겨찾기, 상세 매매 흐름을 강화</w:t>
-            </w:r>
-          </w:p>
-        </w:tc>
-      </w:tr>
-      <w:tr>
-        <w:tc>
-          <w:tcPr>
-            <w:tcW w:type="dxa" w:w="3024"/>
-            <w:shd w:fill="F6F9FD"/>
-            <w:vAlign w:val="center"/>
-          </w:tcPr>
-          <w:p>
-            <w:pPr>
-              <w:spacing w:after="0"/>
-            </w:pPr>
-            <w:r/>
-            <w:r>
-              <w:rPr>
-                <w:rFonts w:ascii="맑은 고딕" w:hAnsi="맑은 고딕" w:eastAsia="맑은 고딕"/>
-                <w:b w:val="0"/>
-                <w:sz w:val="18"/>
-              </w:rPr>
-              <w:t>서버 실행</w:t>
-            </w:r>
-          </w:p>
-        </w:tc>
-        <w:tc>
-          <w:tcPr>
-            <w:tcW w:type="dxa" w:w="7344"/>
-            <w:shd w:fill="F6F9FD"/>
-            <w:vAlign w:val="center"/>
-          </w:tcPr>
-          <w:p>
-            <w:pPr>
-              <w:spacing w:after="0"/>
-            </w:pPr>
-            <w:r/>
-            <w:r>
-              <w:rPr>
-                <w:rFonts w:ascii="맑은 고딕" w:hAnsi="맑은 고딕" w:eastAsia="맑은 고딕"/>
-                <w:b w:val="0"/>
-                <w:sz w:val="18"/>
-              </w:rPr>
-              <w:t>VS Code 작업, PowerShell 실행 스크립트, 시작 작업 등록 스크립트를 준비</w:t>
+              <w:t>메모리 기반 구조에서는 서버를 재시작하면 회원, 보유 주식, 거래 기록이 사라졌다. 이를 해결하기 위해 MySQL 테이블 구조를 설계하고 거래 기록과 보유 종목을 저장하는 방식으로 바꿨다.</w:t>
             </w:r>
           </w:p>
         </w:tc>
@@ -3483,6 +3399,49 @@
                 <w:b w:val="0"/>
                 <w:sz w:val="18"/>
               </w:rPr>
+              <w:t>SecureRandom / MessageDigest</w:t>
+            </w:r>
+          </w:p>
+        </w:tc>
+        <w:tc>
+          <w:tcPr>
+            <w:tcW w:type="dxa" w:w="7200"/>
+            <w:shd w:fill="F6F9FD"/>
+            <w:vAlign w:val="center"/>
+          </w:tcPr>
+          <w:p>
+            <w:pPr>
+              <w:spacing w:after="0"/>
+            </w:pPr>
+            <w:r/>
+            <w:r>
+              <w:rPr>
+                <w:rFonts w:ascii="맑은 고딕" w:hAnsi="맑은 고딕" w:eastAsia="맑은 고딕"/>
+                <w:b w:val="0"/>
+                <w:sz w:val="18"/>
+              </w:rPr>
+              <w:t>비밀번호 Salt 생성과 SHA-256 해시 검증</w:t>
+            </w:r>
+          </w:p>
+        </w:tc>
+      </w:tr>
+      <w:tr>
+        <w:tc>
+          <w:tcPr>
+            <w:tcW w:type="dxa" w:w="3168"/>
+            <w:vAlign w:val="center"/>
+          </w:tcPr>
+          <w:p>
+            <w:pPr>
+              <w:spacing w:after="0"/>
+            </w:pPr>
+            <w:r/>
+            <w:r>
+              <w:rPr>
+                <w:rFonts w:ascii="맑은 고딕" w:hAnsi="맑은 고딕" w:eastAsia="맑은 고딕"/>
+                <w:b w:val="0"/>
+                <w:sz w:val="18"/>
+              </w:rPr>
               <w:t>Files / Path</w:t>
             </w:r>
           </w:p>
@@ -3490,7 +3449,6 @@
         <w:tc>
           <w:tcPr>
             <w:tcW w:type="dxa" w:w="7200"/>
-            <w:shd w:fill="F6F9FD"/>
             <w:vAlign w:val="center"/>
           </w:tcPr>
           <w:p>
@@ -3513,6 +3471,7 @@
         <w:tc>
           <w:tcPr>
             <w:tcW w:type="dxa" w:w="3168"/>
+            <w:shd w:fill="F6F9FD"/>
             <w:vAlign w:val="center"/>
           </w:tcPr>
           <w:p>
@@ -3533,6 +3492,7 @@
         <w:tc>
           <w:tcPr>
             <w:tcW w:type="dxa" w:w="7200"/>
+            <w:shd w:fill="F6F9FD"/>
             <w:vAlign w:val="center"/>
           </w:tcPr>
           <w:p>
@@ -3555,7 +3515,6 @@
         <w:tc>
           <w:tcPr>
             <w:tcW w:type="dxa" w:w="3168"/>
-            <w:shd w:fill="F6F9FD"/>
             <w:vAlign w:val="center"/>
           </w:tcPr>
           <w:p>
@@ -3576,7 +3535,6 @@
         <w:tc>
           <w:tcPr>
             <w:tcW w:type="dxa" w:w="7200"/>
-            <w:shd w:fill="F6F9FD"/>
             <w:vAlign w:val="center"/>
           </w:tcPr>
           <w:p>
@@ -3969,7 +3927,7 @@
         <w:spacing w:after="120"/>
       </w:pPr>
       <w:r>
-        <w:t>프로젝트에는 REST API만 사용하는 구조에서 한 단계 더 나아가기 위해 모의 증권사 소켓 서버 구조도 추가했다. BrokerIntegration은 ServerSocket과 클라이언트 구독 명령을 이용해 특정 종목의 가격 Tick을 전달하는 구조다. 실제 한국투자증권 WebSocket 실시간 체결가를 완전히 대체하는 것은 아니지만, 멀티 클라이언트 구독과 실시간 전송 구조를 Java Thread 기반으로 실험했다는 점에 의미가 있다.</w:t>
+        <w:t>프로젝트에는 REST API만 사용하는 구조에서 한 단계 더 나아가기 위해 모의 증권사 소켓 서버 구조와 KIS WebSocket 구독 시도 구조를 추가했다. BrokerIntegration은 ServerSocket과 클라이언트 구독 명령을 이용해 특정 종목의 가격 Tick을 전달하는 구조다. KisWebSocketQuoteClient는 승인키 발급, 국내주식 체결 구독 메시지 전송, 체결 메시지 파싱, BrokerTick 변환 흐름을 갖는다.</w:t>
       </w:r>
     </w:p>
     <w:p>
@@ -4005,7 +3963,68 @@
         <w:spacing w:after="60"/>
       </w:pPr>
       <w:r>
-        <w:t>향후 개선 시 KIS WebSocket 실시간 체결가 API와 같은 방식으로 확장할 수 있다.</w:t>
+        <w:t>KIS WebSocket 시작 또는 실행 중 오류가 발생하면 REST 폴링으로 자동 전환되도록 보완했다.</w:t>
+      </w:r>
+    </w:p>
+    <w:p>
+      <w:pPr>
+        <w:pStyle w:val="ListBullet"/>
+        <w:spacing w:after="60"/>
+      </w:pPr>
+      <w:r>
+        <w:t>다만 실제 KIS 테스트베드에서 구독 성공 여부와 메시지 필드 순서는 별도 실계정/모의계정 환경에서 추가 검증이 필요하다.</w:t>
+      </w:r>
+    </w:p>
+    <w:p>
+      <w:pPr>
+        <w:pStyle w:val="Heading2"/>
+      </w:pPr>
+      <w:r>
+        <w:t>9.1 보안과 세션 관리 보완</w:t>
+      </w:r>
+    </w:p>
+    <w:p>
+      <w:pPr>
+        <w:spacing w:after="120"/>
+      </w:pPr>
+      <w:r>
+        <w:t>초기 구조는 서버 안의 currentMember 필드로 로그인 사용자를 기억하고, 비밀번호도 평문에 가까운 형태로 저장했다. 이 방식은 한 명이 시험할 때는 단순하지만 여러 브라우저나 여러 사용자를 생각하면 맞지 않는다. 그래서 로그인 성공 시 서버가 세션 토큰을 발급하고, 브라우저에는 HttpOnly 쿠키인 MSTOCK_SESSION을 내려주는 방식으로 변경했다.</w:t>
+      </w:r>
+    </w:p>
+    <w:p>
+      <w:pPr>
+        <w:pStyle w:val="ListBullet"/>
+        <w:spacing w:after="60"/>
+      </w:pPr>
+      <w:r>
+        <w:t>회원가입 시 비밀번호를 그대로 저장하지 않고 Salt와 SHA-256 해시 조합으로 저장한다.</w:t>
+      </w:r>
+    </w:p>
+    <w:p>
+      <w:pPr>
+        <w:pStyle w:val="ListBullet"/>
+        <w:spacing w:after="60"/>
+      </w:pPr>
+      <w:r>
+        <w:t>기존에 평문으로 남아 있던 비밀번호는 로그인 성공 시 해시 형태로 자동 업그레이드한다.</w:t>
+      </w:r>
+    </w:p>
+    <w:p>
+      <w:pPr>
+        <w:pStyle w:val="ListBullet"/>
+        <w:spacing w:after="60"/>
+      </w:pPr>
+      <w:r>
+        <w:t>각 요청은 쿠키의 세션 토큰으로 회원을 찾기 때문에 서버 전체 currentMember 하나에 의존하지 않는다.</w:t>
+      </w:r>
+    </w:p>
+    <w:p>
+      <w:pPr>
+        <w:pStyle w:val="ListBullet"/>
+        <w:spacing w:after="60"/>
+      </w:pPr>
+      <w:r>
+        <w:t>HTTPS 적용, 세션 만료 시간, CSRF 방어는 실제 배포 단계에서 추가해야 할 보완점으로 남겼다.</w:t>
       </w:r>
     </w:p>
     <w:p>
@@ -4903,7 +4922,7 @@
         <w:spacing w:after="120"/>
       </w:pPr>
       <w:r>
-        <w:t>향후 개선한다면 KIS WebSocket 실시간 체결가 연동, 비밀번호 해시와 세션 보안 강화, 패키지 분리, 테스트 코드 추가, HTTPS 배포 환경 적용을 우선적으로 진행할 수 있다.</w:t>
+        <w:t>향후 개선한다면 실제 KIS 테스트베드에서 WebSocket 구독 성공 여부를 확인하고, controller, service, repository, model 패키지로 소스 구조를 분리하는 작업이 우선이다. 현재는 과제 제출과 컴파일 검증을 쉽게 하기 위해 루트 디렉터리 중심 구조를 유지했다. 이후에는 테스트 코드 추가, HTTPS 배포 환경 적용, 세션 만료 시간과 CSRF 방어, 업종별 위험 등급 UI 표시, 개인화 관심종목 추천 같은 기능을 확장할 수 있다.</w:t>
       </w:r>
     </w:p>
     <w:sectPr>

</xml_diff>

<commit_message>
Expand class library structure docs
</commit_message>
<xml_diff>
--- a/deliverables/Java_모의주식투자_개인프로젝트_보고서.docx
+++ b/deliverables/Java_모의주식투자_개인프로젝트_보고서.docx
@@ -1488,7 +1488,808 @@
         <w:pStyle w:val="Heading2"/>
       </w:pPr>
       <w:r>
-        <w:t>3.2 주요 코드 일부</w:t>
+        <w:t>3.2 클래스/라이브러리 구조 상세</w:t>
+      </w:r>
+    </w:p>
+    <w:p>
+      <w:pPr>
+        <w:spacing w:after="120"/>
+      </w:pPr>
+      <w:r>
+        <w:t>프로젝트는 현재 과제 제출과 단일 javac 컴파일을 쉽게 하기 위해 루트 디렉터리 중심으로 구성했다. 다만 내부 역할은 서버, 핵심 서비스, 도메인 모델, 외부 시세, 저장소, 보안, 화면 생성으로 나누어 볼 수 있다. 발표에서는 아래 표를 기준으로 어떤 클래스가 어떤 Java 라이브러리를 사용했는지 설명하면 된다.</w:t>
+      </w:r>
+    </w:p>
+    <w:tbl>
+      <w:tblPr>
+        <w:tblStyle w:val="TableGrid"/>
+        <w:tblW w:type="auto" w:w="0"/>
+        <w:jc w:val="center"/>
+        <w:tblLook w:firstColumn="1" w:firstRow="1" w:lastColumn="0" w:lastRow="0" w:noHBand="0" w:noVBand="1" w:val="04A0"/>
+      </w:tblPr>
+      <w:tblGrid>
+        <w:gridCol w:w="2448"/>
+        <w:gridCol w:w="2448"/>
+        <w:gridCol w:w="2448"/>
+        <w:gridCol w:w="2448"/>
+      </w:tblGrid>
+      <w:tr>
+        <w:tc>
+          <w:tcPr>
+            <w:tcW w:type="dxa" w:w="1944"/>
+            <w:shd w:fill="122033"/>
+            <w:vAlign w:val="center"/>
+          </w:tcPr>
+          <w:p>
+            <w:pPr>
+              <w:spacing w:after="0"/>
+            </w:pPr>
+            <w:r/>
+            <w:r>
+              <w:rPr>
+                <w:rFonts w:ascii="맑은 고딕" w:hAnsi="맑은 고딕" w:eastAsia="맑은 고딕"/>
+                <w:b/>
+                <w:color w:val="FFFFFF"/>
+                <w:sz w:val="18"/>
+              </w:rPr>
+              <w:t>계층</w:t>
+            </w:r>
+          </w:p>
+        </w:tc>
+        <w:tc>
+          <w:tcPr>
+            <w:tcW w:type="dxa" w:w="3024"/>
+            <w:shd w:fill="122033"/>
+            <w:vAlign w:val="center"/>
+          </w:tcPr>
+          <w:p>
+            <w:pPr>
+              <w:spacing w:after="0"/>
+            </w:pPr>
+            <w:r/>
+            <w:r>
+              <w:rPr>
+                <w:rFonts w:ascii="맑은 고딕" w:hAnsi="맑은 고딕" w:eastAsia="맑은 고딕"/>
+                <w:b/>
+                <w:color w:val="FFFFFF"/>
+                <w:sz w:val="18"/>
+              </w:rPr>
+              <w:t>주요 클래스</w:t>
+            </w:r>
+          </w:p>
+        </w:tc>
+        <w:tc>
+          <w:tcPr>
+            <w:tcW w:type="dxa" w:w="3168"/>
+            <w:shd w:fill="122033"/>
+            <w:vAlign w:val="center"/>
+          </w:tcPr>
+          <w:p>
+            <w:pPr>
+              <w:spacing w:after="0"/>
+            </w:pPr>
+            <w:r/>
+            <w:r>
+              <w:rPr>
+                <w:rFonts w:ascii="맑은 고딕" w:hAnsi="맑은 고딕" w:eastAsia="맑은 고딕"/>
+                <w:b/>
+                <w:color w:val="FFFFFF"/>
+                <w:sz w:val="18"/>
+              </w:rPr>
+              <w:t>사용 라이브러리/문법</w:t>
+            </w:r>
+          </w:p>
+        </w:tc>
+        <w:tc>
+          <w:tcPr>
+            <w:tcW w:type="dxa" w:w="3312"/>
+            <w:shd w:fill="122033"/>
+            <w:vAlign w:val="center"/>
+          </w:tcPr>
+          <w:p>
+            <w:pPr>
+              <w:spacing w:after="0"/>
+            </w:pPr>
+            <w:r/>
+            <w:r>
+              <w:rPr>
+                <w:rFonts w:ascii="맑은 고딕" w:hAnsi="맑은 고딕" w:eastAsia="맑은 고딕"/>
+                <w:b/>
+                <w:color w:val="FFFFFF"/>
+                <w:sz w:val="18"/>
+              </w:rPr>
+              <w:t>역할</w:t>
+            </w:r>
+          </w:p>
+        </w:tc>
+      </w:tr>
+      <w:tr>
+        <w:tc>
+          <w:tcPr>
+            <w:tcW w:type="dxa" w:w="1944"/>
+            <w:vAlign w:val="center"/>
+          </w:tcPr>
+          <w:p>
+            <w:pPr>
+              <w:spacing w:after="0"/>
+            </w:pPr>
+            <w:r/>
+            <w:r>
+              <w:rPr>
+                <w:rFonts w:ascii="맑은 고딕" w:hAnsi="맑은 고딕" w:eastAsia="맑은 고딕"/>
+                <w:b w:val="0"/>
+                <w:sz w:val="18"/>
+              </w:rPr>
+              <w:t>실행/서버 계층</w:t>
+            </w:r>
+          </w:p>
+        </w:tc>
+        <w:tc>
+          <w:tcPr>
+            <w:tcW w:type="dxa" w:w="3024"/>
+            <w:vAlign w:val="center"/>
+          </w:tcPr>
+          <w:p>
+            <w:pPr>
+              <w:spacing w:after="0"/>
+            </w:pPr>
+            <w:r/>
+            <w:r>
+              <w:rPr>
+                <w:rFonts w:ascii="맑은 고딕" w:hAnsi="맑은 고딕" w:eastAsia="맑은 고딕"/>
+                <w:b w:val="0"/>
+                <w:sz w:val="18"/>
+              </w:rPr>
+              <w:t>MiniProjectApp, MiniHandler</w:t>
+            </w:r>
+          </w:p>
+        </w:tc>
+        <w:tc>
+          <w:tcPr>
+            <w:tcW w:type="dxa" w:w="3168"/>
+            <w:vAlign w:val="center"/>
+          </w:tcPr>
+          <w:p>
+            <w:pPr>
+              <w:spacing w:after="0"/>
+            </w:pPr>
+            <w:r/>
+            <w:r>
+              <w:rPr>
+                <w:rFonts w:ascii="맑은 고딕" w:hAnsi="맑은 고딕" w:eastAsia="맑은 고딕"/>
+                <w:b w:val="0"/>
+                <w:sz w:val="18"/>
+              </w:rPr>
+              <w:t>HttpServer, HttpExchange, Executors</w:t>
+            </w:r>
+          </w:p>
+        </w:tc>
+        <w:tc>
+          <w:tcPr>
+            <w:tcW w:type="dxa" w:w="3312"/>
+            <w:vAlign w:val="center"/>
+          </w:tcPr>
+          <w:p>
+            <w:pPr>
+              <w:spacing w:after="0"/>
+            </w:pPr>
+            <w:r/>
+            <w:r>
+              <w:rPr>
+                <w:rFonts w:ascii="맑은 고딕" w:hAnsi="맑은 고딕" w:eastAsia="맑은 고딕"/>
+                <w:b w:val="0"/>
+                <w:sz w:val="18"/>
+              </w:rPr>
+              <w:t>웹 서버 시작, URL 라우팅, 요청/응답 처리</w:t>
+            </w:r>
+          </w:p>
+        </w:tc>
+      </w:tr>
+      <w:tr>
+        <w:tc>
+          <w:tcPr>
+            <w:tcW w:type="dxa" w:w="1944"/>
+            <w:shd w:fill="F6F9FD"/>
+            <w:vAlign w:val="center"/>
+          </w:tcPr>
+          <w:p>
+            <w:pPr>
+              <w:spacing w:after="0"/>
+            </w:pPr>
+            <w:r/>
+            <w:r>
+              <w:rPr>
+                <w:rFonts w:ascii="맑은 고딕" w:hAnsi="맑은 고딕" w:eastAsia="맑은 고딕"/>
+                <w:b w:val="0"/>
+                <w:sz w:val="18"/>
+              </w:rPr>
+              <w:t>핵심 서비스 계층</w:t>
+            </w:r>
+          </w:p>
+        </w:tc>
+        <w:tc>
+          <w:tcPr>
+            <w:tcW w:type="dxa" w:w="3024"/>
+            <w:shd w:fill="F6F9FD"/>
+            <w:vAlign w:val="center"/>
+          </w:tcPr>
+          <w:p>
+            <w:pPr>
+              <w:spacing w:after="0"/>
+            </w:pPr>
+            <w:r/>
+            <w:r>
+              <w:rPr>
+                <w:rFonts w:ascii="맑은 고딕" w:hAnsi="맑은 고딕" w:eastAsia="맑은 고딕"/>
+                <w:b w:val="0"/>
+                <w:sz w:val="18"/>
+              </w:rPr>
+              <w:t>MiniProject</w:t>
+            </w:r>
+          </w:p>
+        </w:tc>
+        <w:tc>
+          <w:tcPr>
+            <w:tcW w:type="dxa" w:w="3168"/>
+            <w:shd w:fill="F6F9FD"/>
+            <w:vAlign w:val="center"/>
+          </w:tcPr>
+          <w:p>
+            <w:pPr>
+              <w:spacing w:after="0"/>
+            </w:pPr>
+            <w:r/>
+            <w:r>
+              <w:rPr>
+                <w:rFonts w:ascii="맑은 고딕" w:hAnsi="맑은 고딕" w:eastAsia="맑은 고딕"/>
+                <w:b w:val="0"/>
+                <w:sz w:val="18"/>
+              </w:rPr>
+              <w:t>ConcurrentHashMap, ArrayList, Comparator, LocalDateTime</w:t>
+            </w:r>
+          </w:p>
+        </w:tc>
+        <w:tc>
+          <w:tcPr>
+            <w:tcW w:type="dxa" w:w="3312"/>
+            <w:shd w:fill="F6F9FD"/>
+            <w:vAlign w:val="center"/>
+          </w:tcPr>
+          <w:p>
+            <w:pPr>
+              <w:spacing w:after="0"/>
+            </w:pPr>
+            <w:r/>
+            <w:r>
+              <w:rPr>
+                <w:rFonts w:ascii="맑은 고딕" w:hAnsi="맑은 고딕" w:eastAsia="맑은 고딕"/>
+                <w:b w:val="0"/>
+                <w:sz w:val="18"/>
+              </w:rPr>
+              <w:t>매수/매도 처리, 포트폴리오 계산, 시세 상태 관리</w:t>
+            </w:r>
+          </w:p>
+        </w:tc>
+      </w:tr>
+      <w:tr>
+        <w:tc>
+          <w:tcPr>
+            <w:tcW w:type="dxa" w:w="1944"/>
+            <w:vAlign w:val="center"/>
+          </w:tcPr>
+          <w:p>
+            <w:pPr>
+              <w:spacing w:after="0"/>
+            </w:pPr>
+            <w:r/>
+            <w:r>
+              <w:rPr>
+                <w:rFonts w:ascii="맑은 고딕" w:hAnsi="맑은 고딕" w:eastAsia="맑은 고딕"/>
+                <w:b w:val="0"/>
+                <w:sz w:val="18"/>
+              </w:rPr>
+              <w:t>도메인 모델 계층</w:t>
+            </w:r>
+          </w:p>
+        </w:tc>
+        <w:tc>
+          <w:tcPr>
+            <w:tcW w:type="dxa" w:w="3024"/>
+            <w:vAlign w:val="center"/>
+          </w:tcPr>
+          <w:p>
+            <w:pPr>
+              <w:spacing w:after="0"/>
+            </w:pPr>
+            <w:r/>
+            <w:r>
+              <w:rPr>
+                <w:rFonts w:ascii="맑은 고딕" w:hAnsi="맑은 고딕" w:eastAsia="맑은 고딕"/>
+                <w:b w:val="0"/>
+                <w:sz w:val="18"/>
+              </w:rPr>
+              <w:t>Member, Stock, Share, TradeLog, PricePoint</w:t>
+            </w:r>
+          </w:p>
+        </w:tc>
+        <w:tc>
+          <w:tcPr>
+            <w:tcW w:type="dxa" w:w="3168"/>
+            <w:vAlign w:val="center"/>
+          </w:tcPr>
+          <w:p>
+            <w:pPr>
+              <w:spacing w:after="0"/>
+            </w:pPr>
+            <w:r/>
+            <w:r>
+              <w:rPr>
+                <w:rFonts w:ascii="맑은 고딕" w:hAnsi="맑은 고딕" w:eastAsia="맑은 고딕"/>
+                <w:b w:val="0"/>
+                <w:sz w:val="18"/>
+              </w:rPr>
+              <w:t>Java class, 컬렉션 객체</w:t>
+            </w:r>
+          </w:p>
+        </w:tc>
+        <w:tc>
+          <w:tcPr>
+            <w:tcW w:type="dxa" w:w="3312"/>
+            <w:vAlign w:val="center"/>
+          </w:tcPr>
+          <w:p>
+            <w:pPr>
+              <w:spacing w:after="0"/>
+            </w:pPr>
+            <w:r/>
+            <w:r>
+              <w:rPr>
+                <w:rFonts w:ascii="맑은 고딕" w:hAnsi="맑은 고딕" w:eastAsia="맑은 고딕"/>
+                <w:b w:val="0"/>
+                <w:sz w:val="18"/>
+              </w:rPr>
+              <w:t>회원, 종목, 보유 수량, 거래 기록, 가격 이력 표현</w:t>
+            </w:r>
+          </w:p>
+        </w:tc>
+      </w:tr>
+      <w:tr>
+        <w:tc>
+          <w:tcPr>
+            <w:tcW w:type="dxa" w:w="1944"/>
+            <w:shd w:fill="F6F9FD"/>
+            <w:vAlign w:val="center"/>
+          </w:tcPr>
+          <w:p>
+            <w:pPr>
+              <w:spacing w:after="0"/>
+            </w:pPr>
+            <w:r/>
+            <w:r>
+              <w:rPr>
+                <w:rFonts w:ascii="맑은 고딕" w:hAnsi="맑은 고딕" w:eastAsia="맑은 고딕"/>
+                <w:b w:val="0"/>
+                <w:sz w:val="18"/>
+              </w:rPr>
+              <w:t>외부 시세 계층</w:t>
+            </w:r>
+          </w:p>
+        </w:tc>
+        <w:tc>
+          <w:tcPr>
+            <w:tcW w:type="dxa" w:w="3024"/>
+            <w:shd w:fill="F6F9FD"/>
+            <w:vAlign w:val="center"/>
+          </w:tcPr>
+          <w:p>
+            <w:pPr>
+              <w:spacing w:after="0"/>
+            </w:pPr>
+            <w:r/>
+            <w:r>
+              <w:rPr>
+                <w:rFonts w:ascii="맑은 고딕" w:hAnsi="맑은 고딕" w:eastAsia="맑은 고딕"/>
+                <w:b w:val="0"/>
+                <w:sz w:val="18"/>
+              </w:rPr>
+              <w:t>KisQuoteClient, KisQuotePoller, KisWebSocketQuoteClient</w:t>
+            </w:r>
+          </w:p>
+        </w:tc>
+        <w:tc>
+          <w:tcPr>
+            <w:tcW w:type="dxa" w:w="3168"/>
+            <w:shd w:fill="F6F9FD"/>
+            <w:vAlign w:val="center"/>
+          </w:tcPr>
+          <w:p>
+            <w:pPr>
+              <w:spacing w:after="0"/>
+            </w:pPr>
+            <w:r/>
+            <w:r>
+              <w:rPr>
+                <w:rFonts w:ascii="맑은 고딕" w:hAnsi="맑은 고딕" w:eastAsia="맑은 고딕"/>
+                <w:b w:val="0"/>
+                <w:sz w:val="18"/>
+              </w:rPr>
+              <w:t>HttpClient, HttpRequest, WebSocket</w:t>
+            </w:r>
+          </w:p>
+        </w:tc>
+        <w:tc>
+          <w:tcPr>
+            <w:tcW w:type="dxa" w:w="3312"/>
+            <w:shd w:fill="F6F9FD"/>
+            <w:vAlign w:val="center"/>
+          </w:tcPr>
+          <w:p>
+            <w:pPr>
+              <w:spacing w:after="0"/>
+            </w:pPr>
+            <w:r/>
+            <w:r>
+              <w:rPr>
+                <w:rFonts w:ascii="맑은 고딕" w:hAnsi="맑은 고딕" w:eastAsia="맑은 고딕"/>
+                <w:b w:val="0"/>
+                <w:sz w:val="18"/>
+              </w:rPr>
+              <w:t>KIS REST 현재가 조회, 거래량 상위 종목 갱신, WebSocket 연동 시도</w:t>
+            </w:r>
+          </w:p>
+        </w:tc>
+      </w:tr>
+      <w:tr>
+        <w:tc>
+          <w:tcPr>
+            <w:tcW w:type="dxa" w:w="1944"/>
+            <w:vAlign w:val="center"/>
+          </w:tcPr>
+          <w:p>
+            <w:pPr>
+              <w:spacing w:after="0"/>
+            </w:pPr>
+            <w:r/>
+            <w:r>
+              <w:rPr>
+                <w:rFonts w:ascii="맑은 고딕" w:hAnsi="맑은 고딕" w:eastAsia="맑은 고딕"/>
+                <w:b w:val="0"/>
+                <w:sz w:val="18"/>
+              </w:rPr>
+              <w:t>저장소 계층</w:t>
+            </w:r>
+          </w:p>
+        </w:tc>
+        <w:tc>
+          <w:tcPr>
+            <w:tcW w:type="dxa" w:w="3024"/>
+            <w:vAlign w:val="center"/>
+          </w:tcPr>
+          <w:p>
+            <w:pPr>
+              <w:spacing w:after="0"/>
+            </w:pPr>
+            <w:r/>
+            <w:r>
+              <w:rPr>
+                <w:rFonts w:ascii="맑은 고딕" w:hAnsi="맑은 고딕" w:eastAsia="맑은 고딕"/>
+                <w:b w:val="0"/>
+                <w:sz w:val="18"/>
+              </w:rPr>
+              <w:t>MySqlDatabase, DatabaseSnapshot</w:t>
+            </w:r>
+          </w:p>
+        </w:tc>
+        <w:tc>
+          <w:tcPr>
+            <w:tcW w:type="dxa" w:w="3168"/>
+            <w:vAlign w:val="center"/>
+          </w:tcPr>
+          <w:p>
+            <w:pPr>
+              <w:spacing w:after="0"/>
+            </w:pPr>
+            <w:r/>
+            <w:r>
+              <w:rPr>
+                <w:rFonts w:ascii="맑은 고딕" w:hAnsi="맑은 고딕" w:eastAsia="맑은 고딕"/>
+                <w:b w:val="0"/>
+                <w:sz w:val="18"/>
+              </w:rPr>
+              <w:t>JDBC, DriverManager, PreparedStatement, ResultSet</w:t>
+            </w:r>
+          </w:p>
+        </w:tc>
+        <w:tc>
+          <w:tcPr>
+            <w:tcW w:type="dxa" w:w="3312"/>
+            <w:vAlign w:val="center"/>
+          </w:tcPr>
+          <w:p>
+            <w:pPr>
+              <w:spacing w:after="0"/>
+            </w:pPr>
+            <w:r/>
+            <w:r>
+              <w:rPr>
+                <w:rFonts w:ascii="맑은 고딕" w:hAnsi="맑은 고딕" w:eastAsia="맑은 고딕"/>
+                <w:b w:val="0"/>
+                <w:sz w:val="18"/>
+              </w:rPr>
+              <w:t>회원/보유 종목/거래 기록을 MySQL 테이블로 저장하고 다시 읽기</w:t>
+            </w:r>
+          </w:p>
+        </w:tc>
+      </w:tr>
+      <w:tr>
+        <w:tc>
+          <w:tcPr>
+            <w:tcW w:type="dxa" w:w="1944"/>
+            <w:shd w:fill="F6F9FD"/>
+            <w:vAlign w:val="center"/>
+          </w:tcPr>
+          <w:p>
+            <w:pPr>
+              <w:spacing w:after="0"/>
+            </w:pPr>
+            <w:r/>
+            <w:r>
+              <w:rPr>
+                <w:rFonts w:ascii="맑은 고딕" w:hAnsi="맑은 고딕" w:eastAsia="맑은 고딕"/>
+                <w:b w:val="0"/>
+                <w:sz w:val="18"/>
+              </w:rPr>
+              <w:t>보안/세션 계층</w:t>
+            </w:r>
+          </w:p>
+        </w:tc>
+        <w:tc>
+          <w:tcPr>
+            <w:tcW w:type="dxa" w:w="3024"/>
+            <w:shd w:fill="F6F9FD"/>
+            <w:vAlign w:val="center"/>
+          </w:tcPr>
+          <w:p>
+            <w:pPr>
+              <w:spacing w:after="0"/>
+            </w:pPr>
+            <w:r/>
+            <w:r>
+              <w:rPr>
+                <w:rFonts w:ascii="맑은 고딕" w:hAnsi="맑은 고딕" w:eastAsia="맑은 고딕"/>
+                <w:b w:val="0"/>
+                <w:sz w:val="18"/>
+              </w:rPr>
+              <w:t>PasswordHasher, MiniHandler</w:t>
+            </w:r>
+          </w:p>
+        </w:tc>
+        <w:tc>
+          <w:tcPr>
+            <w:tcW w:type="dxa" w:w="3168"/>
+            <w:shd w:fill="F6F9FD"/>
+            <w:vAlign w:val="center"/>
+          </w:tcPr>
+          <w:p>
+            <w:pPr>
+              <w:spacing w:after="0"/>
+            </w:pPr>
+            <w:r/>
+            <w:r>
+              <w:rPr>
+                <w:rFonts w:ascii="맑은 고딕" w:hAnsi="맑은 고딕" w:eastAsia="맑은 고딕"/>
+                <w:b w:val="0"/>
+                <w:sz w:val="18"/>
+              </w:rPr>
+              <w:t>SecureRandom, MessageDigest, Base64, Cookie</w:t>
+            </w:r>
+          </w:p>
+        </w:tc>
+        <w:tc>
+          <w:tcPr>
+            <w:tcW w:type="dxa" w:w="3312"/>
+            <w:shd w:fill="F6F9FD"/>
+            <w:vAlign w:val="center"/>
+          </w:tcPr>
+          <w:p>
+            <w:pPr>
+              <w:spacing w:after="0"/>
+            </w:pPr>
+            <w:r/>
+            <w:r>
+              <w:rPr>
+                <w:rFonts w:ascii="맑은 고딕" w:hAnsi="맑은 고딕" w:eastAsia="맑은 고딕"/>
+                <w:b w:val="0"/>
+                <w:sz w:val="18"/>
+              </w:rPr>
+              <w:t>비밀번호 Salt 해시, 세션 쿠키 발급, 로그인 상태 관리</w:t>
+            </w:r>
+          </w:p>
+        </w:tc>
+      </w:tr>
+      <w:tr>
+        <w:tc>
+          <w:tcPr>
+            <w:tcW w:type="dxa" w:w="1944"/>
+            <w:vAlign w:val="center"/>
+          </w:tcPr>
+          <w:p>
+            <w:pPr>
+              <w:spacing w:after="0"/>
+            </w:pPr>
+            <w:r/>
+            <w:r>
+              <w:rPr>
+                <w:rFonts w:ascii="맑은 고딕" w:hAnsi="맑은 고딕" w:eastAsia="맑은 고딕"/>
+                <w:b w:val="0"/>
+                <w:sz w:val="18"/>
+              </w:rPr>
+              <w:t>화면/직렬화 계층</w:t>
+            </w:r>
+          </w:p>
+        </w:tc>
+        <w:tc>
+          <w:tcPr>
+            <w:tcW w:type="dxa" w:w="3024"/>
+            <w:vAlign w:val="center"/>
+          </w:tcPr>
+          <w:p>
+            <w:pPr>
+              <w:spacing w:after="0"/>
+            </w:pPr>
+            <w:r/>
+            <w:r>
+              <w:rPr>
+                <w:rFonts w:ascii="맑은 고딕" w:hAnsi="맑은 고딕" w:eastAsia="맑은 고딕"/>
+                <w:b w:val="0"/>
+                <w:sz w:val="18"/>
+              </w:rPr>
+              <w:t>WebPages, Json</w:t>
+            </w:r>
+          </w:p>
+        </w:tc>
+        <w:tc>
+          <w:tcPr>
+            <w:tcW w:type="dxa" w:w="3168"/>
+            <w:vAlign w:val="center"/>
+          </w:tcPr>
+          <w:p>
+            <w:pPr>
+              <w:spacing w:after="0"/>
+            </w:pPr>
+            <w:r/>
+            <w:r>
+              <w:rPr>
+                <w:rFonts w:ascii="맑은 고딕" w:hAnsi="맑은 고딕" w:eastAsia="맑은 고딕"/>
+                <w:b w:val="0"/>
+                <w:sz w:val="18"/>
+              </w:rPr>
+              <w:t>HTML/CSS/JavaScript 문자열, JSON 생성/파싱</w:t>
+            </w:r>
+          </w:p>
+        </w:tc>
+        <w:tc>
+          <w:tcPr>
+            <w:tcW w:type="dxa" w:w="3312"/>
+            <w:vAlign w:val="center"/>
+          </w:tcPr>
+          <w:p>
+            <w:pPr>
+              <w:spacing w:after="0"/>
+            </w:pPr>
+            <w:r/>
+            <w:r>
+              <w:rPr>
+                <w:rFonts w:ascii="맑은 고딕" w:hAnsi="맑은 고딕" w:eastAsia="맑은 고딕"/>
+                <w:b w:val="0"/>
+                <w:sz w:val="18"/>
+              </w:rPr>
+              <w:t>브라우저 화면 렌더링과 API 응답 데이터 구성</w:t>
+            </w:r>
+          </w:p>
+        </w:tc>
+      </w:tr>
+      <w:tr>
+        <w:tc>
+          <w:tcPr>
+            <w:tcW w:type="dxa" w:w="1944"/>
+            <w:shd w:fill="F6F9FD"/>
+            <w:vAlign w:val="center"/>
+          </w:tcPr>
+          <w:p>
+            <w:pPr>
+              <w:spacing w:after="0"/>
+            </w:pPr>
+            <w:r/>
+            <w:r>
+              <w:rPr>
+                <w:rFonts w:ascii="맑은 고딕" w:hAnsi="맑은 고딕" w:eastAsia="맑은 고딕"/>
+                <w:b w:val="0"/>
+                <w:sz w:val="18"/>
+              </w:rPr>
+              <w:t>분류/상속 계층</w:t>
+            </w:r>
+          </w:p>
+        </w:tc>
+        <w:tc>
+          <w:tcPr>
+            <w:tcW w:type="dxa" w:w="3024"/>
+            <w:shd w:fill="F6F9FD"/>
+            <w:vAlign w:val="center"/>
+          </w:tcPr>
+          <w:p>
+            <w:pPr>
+              <w:spacing w:after="0"/>
+            </w:pPr>
+            <w:r/>
+            <w:r>
+              <w:rPr>
+                <w:rFonts w:ascii="맑은 고딕" w:hAnsi="맑은 고딕" w:eastAsia="맑은 고딕"/>
+                <w:b w:val="0"/>
+                <w:sz w:val="18"/>
+              </w:rPr>
+              <w:t>CompanyProfile, CompanyProfiles, StockCategoryProfile</w:t>
+            </w:r>
+          </w:p>
+        </w:tc>
+        <w:tc>
+          <w:tcPr>
+            <w:tcW w:type="dxa" w:w="3168"/>
+            <w:shd w:fill="F6F9FD"/>
+            <w:vAlign w:val="center"/>
+          </w:tcPr>
+          <w:p>
+            <w:pPr>
+              <w:spacing w:after="0"/>
+            </w:pPr>
+            <w:r/>
+            <w:r>
+              <w:rPr>
+                <w:rFonts w:ascii="맑은 고딕" w:hAnsi="맑은 고딕" w:eastAsia="맑은 고딕"/>
+                <w:b w:val="0"/>
+                <w:sz w:val="18"/>
+              </w:rPr>
+              <w:t>abstract class, interface, 구현 클래스</w:t>
+            </w:r>
+          </w:p>
+        </w:tc>
+        <w:tc>
+          <w:tcPr>
+            <w:tcW w:type="dxa" w:w="3312"/>
+            <w:shd w:fill="F6F9FD"/>
+            <w:vAlign w:val="center"/>
+          </w:tcPr>
+          <w:p>
+            <w:pPr>
+              <w:spacing w:after="0"/>
+            </w:pPr>
+            <w:r/>
+            <w:r>
+              <w:rPr>
+                <w:rFonts w:ascii="맑은 고딕" w:hAnsi="맑은 고딕" w:eastAsia="맑은 고딕"/>
+                <w:b w:val="0"/>
+                <w:sz w:val="18"/>
+              </w:rPr>
+              <w:t>회사 설명과 업종/위험 설명을 공통 규칙으로 정리</w:t>
+            </w:r>
+          </w:p>
+        </w:tc>
+      </w:tr>
+    </w:tbl>
+    <w:p/>
+    <w:p>
+      <w:pPr>
+        <w:spacing w:after="120"/>
+      </w:pPr>
+      <w:r>
+        <w:t>나중에 유지보수를 더 쉽게 하려면 controller, service, domain, repository, security, ui 패키지로 물리적인 파일 위치까지 분리할 수 있다. 현재 보고서에서는 실제 코드가 루트 중심이라는 점과, 논리적으로는 위 계층으로 나뉜다는 점을 구분해서 설명한다.</w:t>
+      </w:r>
+    </w:p>
+    <w:p>
+      <w:pPr>
+        <w:pStyle w:val="Heading2"/>
+      </w:pPr>
+      <w:r>
+        <w:t>3.3 주요 코드 일부</w:t>
       </w:r>
     </w:p>
     <w:p>
@@ -1622,7 +2423,7 @@
         <w:pStyle w:val="Heading2"/>
       </w:pPr>
       <w:r>
-        <w:t>3.3 상속과 인터페이스 사용 이유</w:t>
+        <w:t>3.4 상속과 인터페이스 사용 이유</w:t>
       </w:r>
     </w:p>
     <w:p>
@@ -1974,7 +2775,7 @@
         <w:pStyle w:val="Heading2"/>
       </w:pPr>
       <w:r>
-        <w:t>3.4 AI vs 나의 역할</w:t>
+        <w:t>3.5 AI vs 나의 역할</w:t>
       </w:r>
     </w:p>
     <w:tbl>

</xml_diff>